<commit_message>
Complete Supermarket Sales Analysis project
</commit_message>
<xml_diff>
--- a/Archit_Kumar_Chaurasiya_Supermarket_Sales_Analysis_ProjectReport.docx
+++ b/Archit_Kumar_Chaurasiya_Supermarket_Sales_Analysis_ProjectReport.docx
@@ -41,6 +41,19 @@
           <w:sz w:val="24"/>
         </w:rPr>
         <w:t xml:space="preserve">Student Name: Archit Kumar Chaurasiya</w:t>
+      </w:r>
+    </w:p>
+    <w:p>
+      <w:pPr>
+        <w:pStyle w:val="Normal"/>
+        <w:spacing w:after="80"/>
+        <w:jc w:val="center"/>
+      </w:pPr>
+      <w:r>
+        <w:rPr>
+          <w:sz w:val="24"/>
+        </w:rPr>
+        <w:t xml:space="preserve">STU ID: STU6a2e940d2d01b1781437453</w:t>
       </w:r>
     </w:p>
     <w:p>

</xml_diff>